<commit_message>
docs: correct supervised ceiling (stacking 0.980, not LightGBM) + add Scenario-2 limitation
Re-run confirmed LightGBM (0.895) is a weak baseline, not the ceiling; the
supervised stacking ensemble (~0.980 AUROC) is the ceiling and the unsupervised
AE reaches ~99% AUROC / ~90% F1 of it (a stronger, accurate claim). Added the
Scenario-2 under-detection limitation (AE 12/30 vs stacking 27/30) + the
sequence/Transformer-AE future-work direction.
</commit_message>
<xml_diff>
--- a/Argus_Technical_Report.docx
+++ b/Argus_Technical_Report.docx
@@ -2833,7 +2833,7 @@
               <w:t xml:space="preserve">CERT autoencoder</w:t>
             </w:r>
             <w:r>
-              <w:t xml:space="preserve">, Isolation Forest, Weighted-Avg, LightGBM (supervised baseline), peer clustering; calibrates thresholds; exports</w:t>
+              <w:t xml:space="preserve">, Isolation Forest, Weighted-Avg, and supervised references (stacking ensemble + LightGBM), peer clustering; calibrates thresholds; exports</w:t>
             </w:r>
             <w:r>
               <w:t xml:space="preserve"> </w:t>
@@ -5901,13 +5901,19 @@
           <w:b/>
           <w:bCs/>
         </w:rPr>
-        <w:t xml:space="preserve">(e) LightGBM (supervised reference only)</w:t>
-      </w:r>
-      <w:r>
-        <w:t xml:space="preserve"> </w:t>
-      </w:r>
-      <w:r>
-        <w:t xml:space="preserve">—</w:t>
+        <w:t xml:space="preserve">(e) Supervised references (not deployable — require labels).</w:t>
+      </w:r>
+      <w:r>
+        <w:t xml:space="preserve"> </w:t>
+      </w:r>
+      <w:r>
+        <w:t xml:space="preserve">Two supervised models are trained</w:t>
+      </w:r>
+      <w:r>
+        <w:t xml:space="preserve"> </w:t>
+      </w:r>
+      <w:r>
+        <w:t xml:space="preserve">with</w:t>
       </w:r>
       <w:r>
         <w:t xml:space="preserve"> </w:t>
@@ -5916,22 +5922,13 @@
         <w:rPr>
           <w:rStyle w:val="VerbatimChar"/>
         </w:rPr>
-        <w:t xml:space="preserve">n_estimators=200, max_depth=6, lr=0.05</w:t>
-      </w:r>
-      <w:r>
-        <w:t xml:space="preserve">,</w:t>
-      </w:r>
-      <w:r>
-        <w:t xml:space="preserve"> </w:t>
-      </w:r>
-      <w:r>
-        <w:t xml:space="preserve">5-fold StratifiedKFold. Included to show the unsupervised AE reaches ~90% of supervised</w:t>
-      </w:r>
-      <w:r>
-        <w:t xml:space="preserve"> </w:t>
-      </w:r>
-      <w:r>
-        <w:t xml:space="preserve">accuracy</w:t>
+        <w:t xml:space="preserve">StratifiedKFold</w:t>
+      </w:r>
+      <w:r>
+        <w:t xml:space="preserve"> </w:t>
+      </w:r>
+      <w:r>
+        <w:t xml:space="preserve">purely to establish an</w:t>
       </w:r>
       <w:r>
         <w:t xml:space="preserve"> </w:t>
@@ -5941,10 +5938,134 @@
           <w:i/>
           <w:iCs/>
         </w:rPr>
-        <w:t xml:space="preserve">without labels</w:t>
-      </w:r>
-      <w:r>
-        <w:t xml:space="preserve">; not part of the deployed detector.</w:t>
+        <w:t xml:space="preserve">accuracy ceiling</w:t>
+      </w:r>
+      <w:r>
+        <w:t xml:space="preserve">: a</w:t>
+      </w:r>
+      <w:r>
+        <w:t xml:space="preserve"> </w:t>
+      </w:r>
+      <w:r>
+        <w:rPr>
+          <w:b/>
+          <w:bCs/>
+        </w:rPr>
+        <w:t xml:space="preserve">stacking ensemble</w:t>
+      </w:r>
+      <w:r>
+        <w:t xml:space="preserve"> </w:t>
+      </w:r>
+      <w:r>
+        <w:t xml:space="preserve">(the true</w:t>
+      </w:r>
+      <w:r>
+        <w:t xml:space="preserve"> </w:t>
+      </w:r>
+      <w:r>
+        <w:t xml:space="preserve">ceiling,</w:t>
+      </w:r>
+      <w:r>
+        <w:t xml:space="preserve"> </w:t>
+      </w:r>
+      <w:r>
+        <w:rPr>
+          <w:b/>
+          <w:bCs/>
+        </w:rPr>
+        <w:t xml:space="preserve">AUROC ≈ 0.980, F1 ≈ 0.878</w:t>
+      </w:r>
+      <w:r>
+        <w:t xml:space="preserve">) and</w:t>
+      </w:r>
+      <w:r>
+        <w:t xml:space="preserve"> </w:t>
+      </w:r>
+      <w:r>
+        <w:rPr>
+          <w:b/>
+          <w:bCs/>
+        </w:rPr>
+        <w:t xml:space="preserve">LightGBM</w:t>
+      </w:r>
+      <w:r>
+        <w:t xml:space="preserve"> </w:t>
+      </w:r>
+      <w:r>
+        <w:t xml:space="preserve">(</w:t>
+      </w:r>
+      <w:r>
+        <w:rPr>
+          <w:rStyle w:val="VerbatimChar"/>
+        </w:rPr>
+        <w:t xml:space="preserve">n_estimators=200, max_depth=6, lr=0.05</w:t>
+      </w:r>
+      <w:r>
+        <w:t xml:space="preserve">).</w:t>
+      </w:r>
+      <w:r>
+        <w:t xml:space="preserve"> </w:t>
+      </w:r>
+      <w:r>
+        <w:t xml:space="preserve">The unsupervised autoencoder (AUROC ≈ 0.976, F1 ≈ 0.787) reaches</w:t>
+      </w:r>
+      <w:r>
+        <w:t xml:space="preserve"> </w:t>
+      </w:r>
+      <w:r>
+        <w:rPr>
+          <w:b/>
+          <w:bCs/>
+        </w:rPr>
+        <w:t xml:space="preserve">~99% of the supervised stacking</w:t>
+      </w:r>
+      <w:r>
+        <w:rPr>
+          <w:b/>
+          <w:bCs/>
+        </w:rPr>
+        <w:t xml:space="preserve"> </w:t>
+      </w:r>
+      <w:r>
+        <w:rPr>
+          <w:b/>
+          <w:bCs/>
+        </w:rPr>
+        <w:t xml:space="preserve">ensemble’s AUROC and ~90% of its F1 — with no labels</w:t>
+      </w:r>
+      <w:r>
+        <w:t xml:space="preserve"> </w:t>
+      </w:r>
+      <w:r>
+        <w:t xml:space="preserve">— and in fact</w:t>
+      </w:r>
+      <w:r>
+        <w:t xml:space="preserve"> </w:t>
+      </w:r>
+      <w:r>
+        <w:rPr>
+          <w:i/>
+          <w:iCs/>
+        </w:rPr>
+        <w:t xml:space="preserve">outperforms</w:t>
+      </w:r>
+      <w:r>
+        <w:t xml:space="preserve"> </w:t>
+      </w:r>
+      <w:r>
+        <w:t xml:space="preserve">the LightGBM</w:t>
+      </w:r>
+      <w:r>
+        <w:t xml:space="preserve"> </w:t>
+      </w:r>
+      <w:r>
+        <w:t xml:space="preserve">baseline (AUROC ≈ 0.895), so LightGBM is a baseline, not the ceiling. Neither supervised model is</w:t>
+      </w:r>
+      <w:r>
+        <w:t xml:space="preserve"> </w:t>
+      </w:r>
+      <w:r>
+        <w:t xml:space="preserve">part of the deployed detector.</w:t>
       </w:r>
     </w:p>
     <w:bookmarkEnd w:id="28"/>
@@ -8944,6 +9065,160 @@
       </w:r>
     </w:p>
     <w:p>
+      <w:pPr>
+        <w:numPr>
+          <w:ilvl w:val="0"/>
+          <w:numId w:val="1007"/>
+        </w:numPr>
+      </w:pPr>
+      <w:r>
+        <w:rPr>
+          <w:b/>
+          <w:bCs/>
+        </w:rPr>
+        <w:t xml:space="preserve">Per-scenario detection is uneven — Scenario 2 is the weak spot.</w:t>
+      </w:r>
+      <w:r>
+        <w:t xml:space="preserve"> </w:t>
+      </w:r>
+      <w:r>
+        <w:t xml:space="preserve">CERT r4.2 contains three</w:t>
+      </w:r>
+      <w:r>
+        <w:t xml:space="preserve"> </w:t>
+      </w:r>
+      <w:r>
+        <w:t xml:space="preserve">insider scenarios. The autoencoder detects</w:t>
+      </w:r>
+      <w:r>
+        <w:t xml:space="preserve"> </w:t>
+      </w:r>
+      <w:r>
+        <w:rPr>
+          <w:b/>
+          <w:bCs/>
+        </w:rPr>
+        <w:t xml:space="preserve">Scenario 1 (after-hours USB data exfiltration)</w:t>
+      </w:r>
+      <w:r>
+        <w:rPr>
+          <w:b/>
+          <w:bCs/>
+        </w:rPr>
+        <w:t xml:space="preserve"> </w:t>
+      </w:r>
+      <w:r>
+        <w:rPr>
+          <w:b/>
+          <w:bCs/>
+        </w:rPr>
+        <w:t xml:space="preserve">30/30</w:t>
+      </w:r>
+      <w:r>
+        <w:t xml:space="preserve"> </w:t>
+      </w:r>
+      <w:r>
+        <w:t xml:space="preserve">and</w:t>
+      </w:r>
+      <w:r>
+        <w:t xml:space="preserve"> </w:t>
+      </w:r>
+      <w:r>
+        <w:rPr>
+          <w:b/>
+          <w:bCs/>
+        </w:rPr>
+        <w:t xml:space="preserve">Scenario 3 (sysadmin sabotage) 10/10</w:t>
+      </w:r>
+      <w:r>
+        <w:t xml:space="preserve">, but only</w:t>
+      </w:r>
+      <w:r>
+        <w:t xml:space="preserve"> </w:t>
+      </w:r>
+      <w:r>
+        <w:rPr>
+          <w:b/>
+          <w:bCs/>
+        </w:rPr>
+        <w:t xml:space="preserve">Scenario 2 (job-site browsing +</w:t>
+      </w:r>
+      <w:r>
+        <w:rPr>
+          <w:b/>
+          <w:bCs/>
+        </w:rPr>
+        <w:t xml:space="preserve"> </w:t>
+      </w:r>
+      <w:r>
+        <w:rPr>
+          <w:b/>
+          <w:bCs/>
+        </w:rPr>
+        <w:t xml:space="preserve">relative thumb-drive IP theft) 12/30</w:t>
+      </w:r>
+      <w:r>
+        <w:t xml:space="preserve"> </w:t>
+      </w:r>
+      <w:r>
+        <w:t xml:space="preserve">(recall ≈ 0.40). Scenario 2 is a</w:t>
+      </w:r>
+      <w:r>
+        <w:t xml:space="preserve"> </w:t>
+      </w:r>
+      <w:r>
+        <w:rPr>
+          <w:i/>
+          <w:iCs/>
+        </w:rPr>
+        <w:t xml:space="preserve">low-and-slow,</w:t>
+      </w:r>
+      <w:r>
+        <w:rPr>
+          <w:i/>
+          <w:iCs/>
+        </w:rPr>
+        <w:t xml:space="preserve"> </w:t>
+      </w:r>
+      <w:r>
+        <w:rPr>
+          <w:i/>
+          <w:iCs/>
+        </w:rPr>
+        <w:t xml:space="preserve">relative-deviation</w:t>
+      </w:r>
+      <w:r>
+        <w:t xml:space="preserve"> </w:t>
+      </w:r>
+      <w:r>
+        <w:t xml:space="preserve">signal rather than the burst-y USB/after-hours pattern the reconstruction</w:t>
+      </w:r>
+      <w:r>
+        <w:t xml:space="preserve"> </w:t>
+      </w:r>
+      <w:r>
+        <w:t xml:space="preserve">manifold keys on. The supervised stacking ensemble recovers Scenario 2 (27/30), confirming the</w:t>
+      </w:r>
+      <w:r>
+        <w:t xml:space="preserve"> </w:t>
+      </w:r>
+      <w:r>
+        <w:t xml:space="preserve">signal exists in the features but is missed by the unsupervised detector — the same low-and-slow</w:t>
+      </w:r>
+      <w:r>
+        <w:t xml:space="preserve"> </w:t>
+      </w:r>
+      <w:r>
+        <w:t xml:space="preserve">blind spot seen with flaws.cloud’s Level5. Closing it is the main detection-quality future work</w:t>
+      </w:r>
+      <w:r>
+        <w:t xml:space="preserve"> </w:t>
+      </w:r>
+      <w:r>
+        <w:t xml:space="preserve">(see §11).</w:t>
+      </w:r>
+    </w:p>
+    <w:p>
       <w:r>
         <w:pict>
           <v:rect style="width:0;height:1.5pt" o:hralign="center" o:hrstd="t" o:hr="t"/>
@@ -9414,7 +9689,39 @@
               <w:pStyle w:val="Compact"/>
             </w:pPr>
             <w:r>
-              <w:t xml:space="preserve">Supervised gradient-boosting reference model (upper bound to show the AE reaches ~90% of supervised accuracy without labels).</w:t>
+              <w:t xml:space="preserve">Supervised gradient-boosting</w:t>
+            </w:r>
+            <w:r>
+              <w:t xml:space="preserve"> </w:t>
+            </w:r>
+            <w:r>
+              <w:rPr>
+                <w:i/>
+                <w:iCs/>
+              </w:rPr>
+              <w:t xml:space="preserve">baseline</w:t>
+            </w:r>
+            <w:r>
+              <w:t xml:space="preserve"> </w:t>
+            </w:r>
+            <w:r>
+              <w:t xml:space="preserve">(the accuracy ceiling is the supervised</w:t>
+            </w:r>
+            <w:r>
+              <w:t xml:space="preserve"> </w:t>
+            </w:r>
+            <w:r>
+              <w:rPr>
+                <w:b/>
+                <w:bCs/>
+              </w:rPr>
+              <w:t xml:space="preserve">stacking ensemble</w:t>
+            </w:r>
+            <w:r>
+              <w:t xml:space="preserve"> </w:t>
+            </w:r>
+            <w:r>
+              <w:t xml:space="preserve">≈0.980 AUROC; the unsupervised AE reaches ~99% of it without labels and outperforms LightGBM).</w:t>
             </w:r>
           </w:p>
         </w:tc>
@@ -11697,25 +12004,67 @@
         <w:t xml:space="preserve"> </w:t>
       </w:r>
       <w:r>
-        <w:t xml:space="preserve">Isolation Forest and autoencoder scores) and one supervised reference (LightGBM, trained with</w:t>
-      </w:r>
-      <w:r>
-        <w:t xml:space="preserve"> </w:t>
-      </w:r>
-      <w:r>
-        <w:t xml:space="preserve">labels using stratified cross-validation) are implemented for comparison. The supervised model is</w:t>
-      </w:r>
-      <w:r>
-        <w:t xml:space="preserve"> </w:t>
-      </w:r>
-      <w:r>
-        <w:t xml:space="preserve">included solely as an upper bound, to quantify how much accuracy is sacrificed by abandoning</w:t>
-      </w:r>
-      <w:r>
-        <w:t xml:space="preserve"> </w:t>
-      </w:r>
-      <w:r>
-        <w:t xml:space="preserve">labels. A separate, training-free</w:t>
+        <w:t xml:space="preserve">Isolation Forest and autoencoder scores) and two supervised references (a</w:t>
+      </w:r>
+      <w:r>
+        <w:t xml:space="preserve"> </w:t>
+      </w:r>
+      <w:r>
+        <w:rPr>
+          <w:b/>
+          <w:bCs/>
+        </w:rPr>
+        <w:t xml:space="preserve">stacking ensemble</w:t>
+      </w:r>
+      <w:r>
+        <w:t xml:space="preserve"> </w:t>
+      </w:r>
+      <w:r>
+        <w:t xml:space="preserve">and</w:t>
+      </w:r>
+      <w:r>
+        <w:t xml:space="preserve"> </w:t>
+      </w:r>
+      <w:r>
+        <w:rPr>
+          <w:b/>
+          <w:bCs/>
+        </w:rPr>
+        <w:t xml:space="preserve">LightGBM</w:t>
+      </w:r>
+      <w:r>
+        <w:t xml:space="preserve">, trained with labels via stratified cross-validation) are implemented for comparison.</w:t>
+      </w:r>
+      <w:r>
+        <w:t xml:space="preserve"> </w:t>
+      </w:r>
+      <w:r>
+        <w:t xml:space="preserve">The supervised stacking ensemble (AUROC ≈ 0.980) is the</w:t>
+      </w:r>
+      <w:r>
+        <w:t xml:space="preserve"> </w:t>
+      </w:r>
+      <w:r>
+        <w:rPr>
+          <w:i/>
+          <w:iCs/>
+        </w:rPr>
+        <w:t xml:space="preserve">accuracy ceiling</w:t>
+      </w:r>
+      <w:r>
+        <w:t xml:space="preserve">; it quantifies how little</w:t>
+      </w:r>
+      <w:r>
+        <w:t xml:space="preserve"> </w:t>
+      </w:r>
+      <w:r>
+        <w:t xml:space="preserve">is sacrificed by abandoning labels — the unsupervised AE reaches ~99% of its AUROC and ~90% of its</w:t>
+      </w:r>
+      <w:r>
+        <w:t xml:space="preserve"> </w:t>
+      </w:r>
+      <w:r>
+        <w:t xml:space="preserve">F1, and exceeds the LightGBM baseline. A separate, training-free</w:t>
       </w:r>
       <w:r>
         <w:t xml:space="preserve"> </w:t>
@@ -12192,19 +12541,42 @@
         <w:t xml:space="preserve"> </w:t>
       </w:r>
       <w:r>
-        <w:t xml:space="preserve">~90% of a supervised LightGBM upper bound. The autoencoder is trained only on benign-assumed</w:t>
-      </w:r>
-      <w:r>
-        <w:t xml:space="preserve"> </w:t>
-      </w:r>
-      <w:r>
-        <w:t xml:space="preserve">data (no attack labels in the objective); the precise label assumption and evaluation caveats</w:t>
-      </w:r>
-      <w:r>
-        <w:t xml:space="preserve"> </w:t>
-      </w:r>
-      <w:r>
-        <w:t xml:space="preserve">are disclosed in §6.2.</w:t>
+        <w:rPr>
+          <w:b/>
+          <w:bCs/>
+        </w:rPr>
+        <w:t xml:space="preserve">~99% of a supervised stacking ensemble’s AUROC (≈0.980) and ~90% of its F1</w:t>
+      </w:r>
+      <w:r>
+        <w:t xml:space="preserve">, while</w:t>
+      </w:r>
+      <w:r>
+        <w:t xml:space="preserve"> </w:t>
+      </w:r>
+      <w:r>
+        <w:rPr>
+          <w:i/>
+          <w:iCs/>
+        </w:rPr>
+        <w:t xml:space="preserve">outperforming</w:t>
+      </w:r>
+      <w:r>
+        <w:t xml:space="preserve"> </w:t>
+      </w:r>
+      <w:r>
+        <w:t xml:space="preserve">the LightGBM baseline. The autoencoder is trained only on benign-assumed data</w:t>
+      </w:r>
+      <w:r>
+        <w:t xml:space="preserve"> </w:t>
+      </w:r>
+      <w:r>
+        <w:t xml:space="preserve">(no attack labels in the objective); the precise label assumption and evaluation caveats are</w:t>
+      </w:r>
+      <w:r>
+        <w:t xml:space="preserve"> </w:t>
+      </w:r>
+      <w:r>
+        <w:t xml:space="preserve">disclosed in §6.2.</w:t>
       </w:r>
     </w:p>
     <w:p>
@@ -12448,6 +12820,108 @@
       </w:r>
       <w:r>
         <w:t xml:space="preserve">explainability + human-in-the-loop review matter.</w:t>
+      </w:r>
+    </w:p>
+    <w:p>
+      <w:pPr>
+        <w:pStyle w:val="Compact"/>
+        <w:numPr>
+          <w:ilvl w:val="0"/>
+          <w:numId w:val="1010"/>
+        </w:numPr>
+      </w:pPr>
+      <w:r>
+        <w:rPr>
+          <w:b/>
+          <w:bCs/>
+        </w:rPr>
+        <w:t xml:space="preserve">Scenario-2 under-detection (the main detection-quality gap).</w:t>
+      </w:r>
+      <w:r>
+        <w:t xml:space="preserve"> </w:t>
+      </w:r>
+      <w:r>
+        <w:t xml:space="preserve">The autoencoder recovers</w:t>
+      </w:r>
+      <w:r>
+        <w:t xml:space="preserve"> </w:t>
+      </w:r>
+      <w:r>
+        <w:t xml:space="preserve">Scenario 1 (30/30) and Scenario 3 (10/10) but only Scenario 2 (12/30) — a low-and-slow,</w:t>
+      </w:r>
+      <w:r>
+        <w:t xml:space="preserve"> </w:t>
+      </w:r>
+      <w:r>
+        <w:t xml:space="preserve">relative-deviation pattern (job-site browsing + thumb-drive IP theft) that the per-user-day</w:t>
+      </w:r>
+      <w:r>
+        <w:t xml:space="preserve"> </w:t>
+      </w:r>
+      <w:r>
+        <w:t xml:space="preserve">reconstruction manifold under-weights. The supervised stacking ensemble gets 27/30, so the signal</w:t>
+      </w:r>
+      <w:r>
+        <w:t xml:space="preserve"> </w:t>
+      </w:r>
+      <w:r>
+        <w:t xml:space="preserve">is present. The intended fix is a</w:t>
+      </w:r>
+      <w:r>
+        <w:t xml:space="preserve"> </w:t>
+      </w:r>
+      <w:r>
+        <w:rPr>
+          <w:b/>
+          <w:bCs/>
+        </w:rPr>
+        <w:t xml:space="preserve">sequence / Transformer autoencoder</w:t>
+      </w:r>
+      <w:r>
+        <w:t xml:space="preserve"> </w:t>
+      </w:r>
+      <w:r>
+        <w:t xml:space="preserve">over each user’s daily</w:t>
+      </w:r>
+      <w:r>
+        <w:t xml:space="preserve"> </w:t>
+      </w:r>
+      <w:r>
+        <w:t xml:space="preserve">timeline (to model gradual temporal drift rather than single-day aggregates). A prototype was</w:t>
+      </w:r>
+      <w:r>
+        <w:t xml:space="preserve"> </w:t>
+      </w:r>
+      <w:r>
+        <w:t xml:space="preserve">trained but did</w:t>
+      </w:r>
+      <w:r>
+        <w:t xml:space="preserve"> </w:t>
+      </w:r>
+      <w:r>
+        <w:rPr>
+          <w:b/>
+          <w:bCs/>
+        </w:rPr>
+        <w:t xml:space="preserve">not yet</w:t>
+      </w:r>
+      <w:r>
+        <w:t xml:space="preserve"> </w:t>
+      </w:r>
+      <w:r>
+        <w:t xml:space="preserve">improve results — plausibly because only 70 insiders limits training a</w:t>
+      </w:r>
+      <w:r>
+        <w:t xml:space="preserve"> </w:t>
+      </w:r>
+      <w:r>
+        <w:t xml:space="preserve">sequence model; richer temporal features or pre-training are likely needed. This remains the</w:t>
+      </w:r>
+      <w:r>
+        <w:t xml:space="preserve"> </w:t>
+      </w:r>
+      <w:r>
+        <w:t xml:space="preserve">primary future-work direction for detection quality.</w:t>
       </w:r>
     </w:p>
     <w:p>

</xml_diff>

<commit_message>
docs: reframe Scenario-2 future work as time-aware detection study; multi-cloud as primary
Low-and-slow detection is a temporal-representation gap, not a model-capacity gap.
Reframe the future work (paper + technical report) from a single Transformer-AE bet
to a graded comparison of change-point detection (CUSUM), longitudinal features, and
sequence models. Make multi-cloud detection quality (per-source features, Azure native
risk signals) the primary detection-quality direction.
</commit_message>
<xml_diff>
--- a/Argus_Technical_Report.docx
+++ b/Argus_Technical_Report.docx
@@ -9209,13 +9209,19 @@
         <w:t xml:space="preserve"> </w:t>
       </w:r>
       <w:r>
-        <w:t xml:space="preserve">blind spot seen with flaws.cloud’s Level5. Closing it is the main detection-quality future work</w:t>
-      </w:r>
-      <w:r>
-        <w:t xml:space="preserve"> </w:t>
-      </w:r>
-      <w:r>
-        <w:t xml:space="preserve">(see §11).</w:t>
+        <w:t xml:space="preserve">blind spot seen with flaws.cloud’s Level5. It is a temporal-representation gap (each day looks</w:t>
+      </w:r>
+      <w:r>
+        <w:t xml:space="preserve"> </w:t>
+      </w:r>
+      <w:r>
+        <w:t xml:space="preserve">normal; the signal is in the accumulation), addressed in future work by a graded comparison of</w:t>
+      </w:r>
+      <w:r>
+        <w:t xml:space="preserve"> </w:t>
+      </w:r>
+      <w:r>
+        <w:t xml:space="preserve">change-point detection, longitudinal features, and sequence models (see §11).</w:t>
       </w:r>
     </w:p>
     <w:p>
@@ -12835,65 +12841,128 @@
           <w:b/>
           <w:bCs/>
         </w:rPr>
-        <w:t xml:space="preserve">Scenario-2 under-detection (the main detection-quality gap).</w:t>
-      </w:r>
-      <w:r>
-        <w:t xml:space="preserve"> </w:t>
-      </w:r>
-      <w:r>
-        <w:t xml:space="preserve">The autoencoder recovers</w:t>
-      </w:r>
-      <w:r>
-        <w:t xml:space="preserve"> </w:t>
-      </w:r>
-      <w:r>
-        <w:t xml:space="preserve">Scenario 1 (30/30) and Scenario 3 (10/10) but only Scenario 2 (12/30) — a low-and-slow,</w:t>
-      </w:r>
-      <w:r>
-        <w:t xml:space="preserve"> </w:t>
-      </w:r>
-      <w:r>
-        <w:t xml:space="preserve">relative-deviation pattern (job-site browsing + thumb-drive IP theft) that the per-user-day</w:t>
-      </w:r>
-      <w:r>
-        <w:t xml:space="preserve"> </w:t>
-      </w:r>
-      <w:r>
-        <w:t xml:space="preserve">reconstruction manifold under-weights. The supervised stacking ensemble gets 27/30, so the signal</w:t>
-      </w:r>
-      <w:r>
-        <w:t xml:space="preserve"> </w:t>
-      </w:r>
-      <w:r>
-        <w:t xml:space="preserve">is present. The intended fix is a</w:t>
-      </w:r>
-      <w:r>
-        <w:t xml:space="preserve"> </w:t>
-      </w:r>
-      <w:r>
-        <w:rPr>
-          <w:b/>
-          <w:bCs/>
-        </w:rPr>
-        <w:t xml:space="preserve">sequence / Transformer autoencoder</w:t>
-      </w:r>
-      <w:r>
-        <w:t xml:space="preserve"> </w:t>
-      </w:r>
-      <w:r>
-        <w:t xml:space="preserve">over each user’s daily</w:t>
-      </w:r>
-      <w:r>
-        <w:t xml:space="preserve"> </w:t>
-      </w:r>
-      <w:r>
-        <w:t xml:space="preserve">timeline (to model gradual temporal drift rather than single-day aggregates). A prototype was</w:t>
-      </w:r>
-      <w:r>
-        <w:t xml:space="preserve"> </w:t>
-      </w:r>
-      <w:r>
-        <w:t xml:space="preserve">trained but did</w:t>
+        <w:t xml:space="preserve">Scenario-2 under-detection.</w:t>
+      </w:r>
+      <w:r>
+        <w:t xml:space="preserve"> </w:t>
+      </w:r>
+      <w:r>
+        <w:t xml:space="preserve">The autoencoder recovers Scenario 1 (30/30) and Scenario 3</w:t>
+      </w:r>
+      <w:r>
+        <w:t xml:space="preserve"> </w:t>
+      </w:r>
+      <w:r>
+        <w:t xml:space="preserve">(10/10) but only Scenario 2 (12/30) — a low-and-slow, relative-deviation pattern (job-site</w:t>
+      </w:r>
+      <w:r>
+        <w:t xml:space="preserve"> </w:t>
+      </w:r>
+      <w:r>
+        <w:t xml:space="preserve">browsing + thumb-drive IP theft) that the per-user-day reconstruction manifold under-weights. The</w:t>
+      </w:r>
+      <w:r>
+        <w:t xml:space="preserve"> </w:t>
+      </w:r>
+      <w:r>
+        <w:t xml:space="preserve">supervised stacking ensemble gets 27/30, so the signal is present. This is a</w:t>
+      </w:r>
+      <w:r>
+        <w:t xml:space="preserve"> </w:t>
+      </w:r>
+      <w:r>
+        <w:rPr>
+          <w:b/>
+          <w:bCs/>
+        </w:rPr>
+        <w:t xml:space="preserve">temporal-</w:t>
+      </w:r>
+      <w:r>
+        <w:rPr>
+          <w:b/>
+          <w:bCs/>
+        </w:rPr>
+        <w:t xml:space="preserve"> </w:t>
+      </w:r>
+      <w:r>
+        <w:rPr>
+          <w:b/>
+          <w:bCs/>
+        </w:rPr>
+        <w:t xml:space="preserve">representation gap, not a model-capacity gap</w:t>
+      </w:r>
+      <w:r>
+        <w:t xml:space="preserve">: each day looks normal in isolation; the signal is</w:t>
+      </w:r>
+      <w:r>
+        <w:t xml:space="preserve"> </w:t>
+      </w:r>
+      <w:r>
+        <w:t xml:space="preserve">in the accumulation over time. The planned remedy is therefore a</w:t>
+      </w:r>
+      <w:r>
+        <w:t xml:space="preserve"> </w:t>
+      </w:r>
+      <w:r>
+        <w:rPr>
+          <w:b/>
+          <w:bCs/>
+        </w:rPr>
+        <w:t xml:space="preserve">graded comparison of time-aware</w:t>
+      </w:r>
+      <w:r>
+        <w:rPr>
+          <w:b/>
+          <w:bCs/>
+        </w:rPr>
+        <w:t xml:space="preserve"> </w:t>
+      </w:r>
+      <w:r>
+        <w:rPr>
+          <w:b/>
+          <w:bCs/>
+        </w:rPr>
+        <w:t xml:space="preserve">methods</w:t>
+      </w:r>
+      <w:r>
+        <w:t xml:space="preserve"> </w:t>
+      </w:r>
+      <w:r>
+        <w:t xml:space="preserve">— change-point detection (CUSUM, consistent with the statistical-process-control basis</w:t>
+      </w:r>
+      <w:r>
+        <w:t xml:space="preserve"> </w:t>
+      </w:r>
+      <w:r>
+        <w:t xml:space="preserve">in §3), longitudinal trend/cumulative features, and sequence models (LSTM / Transformer</w:t>
+      </w:r>
+      <w:r>
+        <w:t xml:space="preserve"> </w:t>
+      </w:r>
+      <w:r>
+        <w:t xml:space="preserve">autoencoders) — to quantify</w:t>
+      </w:r>
+      <w:r>
+        <w:t xml:space="preserve"> </w:t>
+      </w:r>
+      <w:r>
+        <w:rPr>
+          <w:i/>
+          <w:iCs/>
+        </w:rPr>
+        <w:t xml:space="preserve">how much</w:t>
+      </w:r>
+      <w:r>
+        <w:t xml:space="preserve"> </w:t>
+      </w:r>
+      <w:r>
+        <w:t xml:space="preserve">temporal modelling low-and-slow detection actually needs. A</w:t>
+      </w:r>
+      <w:r>
+        <w:t xml:space="preserve"> </w:t>
+      </w:r>
+      <w:r>
+        <w:t xml:space="preserve">Transformer prototype did</w:t>
       </w:r>
       <w:r>
         <w:t xml:space="preserve"> </w:t>
@@ -12909,19 +12978,80 @@
         <w:t xml:space="preserve"> </w:t>
       </w:r>
       <w:r>
-        <w:t xml:space="preserve">improve results — plausibly because only 70 insiders limits training a</w:t>
-      </w:r>
-      <w:r>
-        <w:t xml:space="preserve"> </w:t>
-      </w:r>
-      <w:r>
-        <w:t xml:space="preserve">sequence model; richer temporal features or pre-training are likely needed. This remains the</w:t>
-      </w:r>
-      <w:r>
-        <w:t xml:space="preserve"> </w:t>
-      </w:r>
-      <w:r>
-        <w:t xml:space="preserve">primary future-work direction for detection quality.</w:t>
+        <w:t xml:space="preserve">improve results (plausibly the 70-insider limit), so the</w:t>
+      </w:r>
+      <w:r>
+        <w:t xml:space="preserve"> </w:t>
+      </w:r>
+      <w:r>
+        <w:t xml:space="preserve">contribution is the comparison itself rather than any single technique; the cheap, theory-grounded</w:t>
+      </w:r>
+      <w:r>
+        <w:t xml:space="preserve"> </w:t>
+      </w:r>
+      <w:r>
+        <w:t xml:space="preserve">methods (CUSUM + longitudinal features) are expected to recover most of the signal without the</w:t>
+      </w:r>
+      <w:r>
+        <w:t xml:space="preserve"> </w:t>
+      </w:r>
+      <w:r>
+        <w:t xml:space="preserve">data-scarcity wall.</w:t>
+      </w:r>
+    </w:p>
+    <w:p>
+      <w:pPr>
+        <w:pStyle w:val="Compact"/>
+        <w:numPr>
+          <w:ilvl w:val="0"/>
+          <w:numId w:val="1010"/>
+        </w:numPr>
+      </w:pPr>
+      <w:r>
+        <w:rPr>
+          <w:b/>
+          <w:bCs/>
+        </w:rPr>
+        <w:t xml:space="preserve">Multi-cloud detection quality (primary detection-quality direction).</w:t>
+      </w:r>
+      <w:r>
+        <w:t xml:space="preserve"> </w:t>
+      </w:r>
+      <w:r>
+        <w:t xml:space="preserve">The cloud AE was trained</w:t>
+      </w:r>
+      <w:r>
+        <w:t xml:space="preserve"> </w:t>
+      </w:r>
+      <w:r>
+        <w:t xml:space="preserve">on AWS CloudTrail, so its pattern features fire sparsely for Azure/GitHub/Cloudflare (those rely</w:t>
+      </w:r>
+      <w:r>
+        <w:t xml:space="preserve"> </w:t>
+      </w:r>
+      <w:r>
+        <w:t xml:space="preserve">more on the source-agnostic rarity layer). Per-source feature engineering — notably feeding</w:t>
+      </w:r>
+      <w:r>
+        <w:t xml:space="preserve"> </w:t>
+      </w:r>
+      <w:r>
+        <w:t xml:space="preserve">Azure’s native risk signals (</w:t>
+      </w:r>
+      <w:r>
+        <w:rPr>
+          <w:rStyle w:val="VerbatimChar"/>
+        </w:rPr>
+        <w:t xml:space="preserve">riskLevelAggregated</w:t>
+      </w:r>
+      <w:r>
+        <w:t xml:space="preserve">, conditional-access status) directly as</w:t>
+      </w:r>
+      <w:r>
+        <w:t xml:space="preserve"> </w:t>
+      </w:r>
+      <w:r>
+        <w:t xml:space="preserve">features — is the main route to uniform multi-cloud detection.</w:t>
       </w:r>
     </w:p>
     <w:p>

</xml_diff>